<commit_message>
Record the fourth validation catch in Appendix A
Section 6's claim that SMV:Digital was uncontrolled was false, and the
search that disproved it also disproved two further claims in the same
draft. The appendix now records that as its own error class: an unverified
criticism is as much a fabrication risk as an unverified number, and harder
to notice, because a critical claim reads as caution rather than as an
assertion needing a source.

Stale check count in A.2 and A.3 corrected from 1,610 to 1,782.

Co-Authored-By: Claude Opus 5 <noreply@anthropic.com>
Claude-Session: https://claude.ai/code/session_01Ax7AbUhZ1yD3sdczLm4auu
</commit_message>
<xml_diff>
--- a/Assignment 2 ECON1596 _ [CLASS GROUP] _ s4040040.docx
+++ b/Assignment 2 ECON1596 _ [CLASS GROUP] _ s4040040.docx
@@ -1704,7 +1704,7 @@
           <w:i w:val="0"/>
           <w:sz w:val="24"/>
         </w:rPr>
-        <w:t>Generative AI was used throughout the assembly of this report's dataset and in drafting its prose. The tool and version were **[TOOL AND VERSION — to be completed by the author]**, used between the start of data assembly and submission on 17 September 2026. This appendix states what was delegated, how each delegation was checked, and — the part that matters — three occasions on which AI assistance introduced an error that validation caught and removed.</w:t>
+        <w:t>Generative AI was used throughout the assembly of this report's dataset and in drafting its prose. The tool and version were **[TOOL AND VERSION — to be completed by the author]**, used between the start of data assembly and submission on 17 September 2026. This appendix states what was delegated, how each delegation was checked, and — the part that matters — four occasions on which AI assistance introduced an error that validation caught and removed.</w:t>
       </w:r>
     </w:p>
     <w:p>
@@ -2022,7 +2022,7 @@
                 <w:b w:val="0"/>
                 <w:sz w:val="20"/>
               </w:rPr>
-              <w:t>Structural assertions at build time; a separate 1,610-check suite</w:t>
+              <w:t>Structural assertions at build time; a separate 1,782-check suite</w:t>
             </w:r>
           </w:p>
         </w:tc>
@@ -2450,7 +2450,7 @@
           <w:i w:val="0"/>
           <w:sz w:val="24"/>
         </w:rPr>
-        <w:t>A.4 Three errors AI assistance introduced, and how each was caught</w:t>
+        <w:t>A.4 Four errors AI assistance introduced, and how each was caught</w:t>
       </w:r>
     </w:p>
     <w:p>
@@ -2510,7 +2510,22 @@
           <w:i w:val="0"/>
           <w:sz w:val="24"/>
         </w:rPr>
-        <w:t>A fourth class is worth recording because it is the opposite failure. During self-audit, the audit tooling raised four alarms — an under-cited figure, an off-palette chart, scatters with no y-values, and a mis-sized figure — all four of which were false, caused by the tooling's own regexes not handling XML namespaces and object types. They were cleared against the raw file contents. An AI-generated check is itself an AI artefact and needs the same scepticism as an AI-generated number.</w:t>
+        <w:t>**A criticism that was already answered.** A late draft of Section 6 asserted that the SMV:Digital scheme was "self-reported and uncontrolled: it measures participation, not effect." The first half was correct. The second was false: a search for the scheme's evaluation found a register-based effect measurement in which Digitaliseringsstyrelsen links recipients to Danmarks Statistik records and compares them with matched control firms (Digitaliseringsstyrelsen 2025b). The report was criticising an absence that does not exist. The same search established that Act 603 of 2023 (Folketinget 2023) had already granted the entitlement a second recommendation proposed, and that a supreme audit institution had rejected the allocation mechanism Appendix F specified (Bundesrechnungshof 2022). All three were rewritten on the verified position, which in each case produced a sharper argument than the one it replaced. The lesson is that an unverified criticism is as much a fabrication risk as an unverified number, and harder to notice, because a critical claim reads as caution rather than as a factual assertion requiring a source.</w:t>
+      </w:r>
+    </w:p>
+    <w:p>
+      <w:pPr>
+        <w:spacing w:before="0" w:after="120"/>
+        <w:jc w:val="both"/>
+      </w:pPr>
+      <w:r>
+        <w:rPr>
+          <w:rFonts w:ascii="Times New Roman" w:hAnsi="Times New Roman"/>
+          <w:b w:val="0"/>
+          <w:i w:val="0"/>
+          <w:sz w:val="24"/>
+        </w:rPr>
+        <w:t>A fifth class is worth recording because it is the opposite failure. During self-audit, the audit tooling raised four alarms — an under-cited figure, an off-palette chart, scatters with no y-values, and a mis-sized figure — all four of which were false, caused by the tooling's own regexes not handling XML namespaces and object types. They were cleared against the raw file contents. An AI-generated check is itself an AI artefact and needs the same scepticism as an AI-generated number.</w:t>
       </w:r>
     </w:p>
     <w:p>
@@ -2540,7 +2555,7 @@
           <w:i w:val="0"/>
           <w:sz w:val="24"/>
         </w:rPr>
-        <w:t>The research question, the country, the policy instrument, the SDG selection, the argument and its thesis, and the judgement about which findings are defensible. Where the evidence and a preferred conclusion disagreed, the evidence was followed — three times, as recorded above.</w:t>
+        <w:t>The research question, the country, the policy instrument, the SDG selection, the argument and its thesis, and the judgement about which findings are defensible. Where the evidence and a preferred conclusion disagreed, the evidence was followed — four times, as recorded above.</w:t>
       </w:r>
     </w:p>
     <w:p>

</xml_diff>

<commit_message>
Add Eurostat e-government adoption benchmark as the report's locating metric
Question 2 opened by claiming Denmark leads Europe on citizen adoption and
then supported it with a figure on which Denmark ranks third. Replace it with
Eurostat isoc_ciegi_ac: 98.5% of individuals aged 16 to 74 used a public
authority website or app in 2024, highest in the EU-27, against an average of
70.0% on the same base.

The indicator measures realised behaviour rather than state provision, and
Eurostat publishes Denmark and the EU-27 on an identical denominator of all
individuals aged 16 to 74, so the two need no adjustment to be compared. That
base differs from the internet-user base of the e-commerce series, which
04_DEFINITIONS now records so the two are not differenced.

Trimmed Question 1 to hold the word count inside the band.

Co-Authored-By: Claude Opus 5 <noreply@anthropic.com>
Claude-Session: https://claude.ai/code/session_01Ax7AbUhZ1yD3sdczLm4auu
</commit_message>
<xml_diff>
--- a/Assignment 2 ECON1596 _ [CLASS GROUP] _ s4040040.docx
+++ b/Assignment 2 ECON1596 _ [CLASS GROUP] _ s4040040.docx
@@ -129,7 +129,7 @@
           <w:i w:val="0"/>
           <w:sz w:val="24"/>
         </w:rPr>
-        <w:t xml:space="preserve"> (Denmark 2012) made a state-run digital mailbox the default legal channel for public correspondence, binding businesses from 2013 and every citizen aged 15 and over from 1 November 2014. Digitaliseringsstyrelsen (2025a) records that the accompanying identity credential, NemID, was replaced by MitID from October 2021 and withdrawn on 31 October 2023. The combination is what distinguishes the Danish case. A mandate alone changes how letters are sent; a mandate plus a universal credential creates shared authentication infrastructure every citizen must hold and any firm may build on without financing its adoption, lowering the fixed cost of services developed on it. Because compulsion accounts for citizens' use, the economic interest lies in what others built there.</w:t>
+        <w:t xml:space="preserve"> (Denmark 2012) made a state-run digital mailbox the default legal channel for public correspondence, binding businesses from 2013 and every citizen aged 15 and over from 1 November 2014. Digitaliseringsstyrelsen (2025a) records that the accompanying credential, NemID, was replaced by MitID from October 2021 and withdrawn on 31 October 2023. The combination is what distinguishes the Danish case. A mandate alone changes how letters are sent; a mandate plus a universal credential creates shared authentication infrastructure every citizen must hold and any firm may build on without financing its adoption, lowering the fixed cost of services built on it. Because compulsion accounts for citizens' use, the economic interest lies in what others built there.</w:t>
       </w:r>
     </w:p>
     <w:p>
@@ -153,7 +153,7 @@
           <w:i w:val="0"/>
           <w:sz w:val="24"/>
         </w:rPr>
-        <w:t xml:space="preserve"> Finans Danmark (2025) reports that Danish retail bank branches fell from 2,025 in 2004 to 665 in 2024, a decline of 67.2% (Figure 1). Taken alone that suggests digitalisation eliminated banking employment, but the longer series qualifies it: between 1991 and 2024 financial institutions fell by 76.7%, from 219 to 51, while bank employment fell by only 29.4%, from roughly 51,000 to 36,000 (Figure 2). Staff per surviving institution therefore rose from 233 to 706, an increase of 203%. The technologies doing this are online and mobile banking authenticated by MitID: with identity verification and correspondence on shared national infrastructure, branches ceased to be the distribution channel, output per institution rose and the sector consolidated rather than shed labour. The three series begin in different years and must not be differenced.</w:t>
+        <w:t xml:space="preserve"> Finans Danmark (2025) reports that Danish retail bank branches fell from 2,025 in 2004 to 665 in 2024, a decline of 67.2% (Figure 1). Taken alone that suggests digitalisation eliminated banking employment, but the longer series qualifies it: between 1991 and 2024 financial institutions fell 76.7%, from 219 to 51, while bank employment fell only 29.4%, from roughly 51,000 to 36,000 (Figure 2). Staff per surviving institution rose from 233 to 706. The technologies doing this are online and mobile banking authenticated by MitID: with identity verification and correspondence on shared national infrastructure, branches ceased to be the distribution channel, output per institution rose and the sector consolidated rather than shed labour. The three series begin in different years and must not be differenced.</w:t>
       </w:r>
     </w:p>
     <w:p>
@@ -219,7 +219,7 @@
           <w:i w:val="0"/>
           <w:sz w:val="24"/>
         </w:rPr>
-        <w:t xml:space="preserve"> Whether wider consumer adoption is associated with greater commercial activity can be tested directly. Using data from Eurostat (2026), Figure 4 plots the share of internet users purchasing online against e-sales as a share of enterprise turnover across the European Union in 2024, the turnover measure from a separate extract (Eurostat 2025c). Across the 18 member states reporting both, the fitted slope is +0.602 percentage points of turnover per percentage point of adoption, with a standard error of 0.105 and an R² of 0.674. Appendix A reports the diagnostics. Causation is not established: adoption is measured on consumers and turnover on enterprises, and national income appears on neither axis. Denmark sits above the line by less than one residual standard error and behind three other states, consistent with the European pattern rather than exceptional to it.</w:t>
+        <w:t xml:space="preserve"> Whether wider consumer adoption is associated with greater commercial activity can be tested directly. Using data from Eurostat (2026), Figure 4 plots the share of internet users purchasing online against e-sales as a share of enterprise turnover across the European Union in 2024, the turnover measure from a separate extract (Eurostat 2025d). Across the 18 member states reporting both, the fitted slope is +0.602 percentage points of turnover per percentage point of adoption, with a standard error of 0.105 and an R² of 0.674. Appendix A reports the diagnostics. Causation is not established: adoption is measured on consumers and turnover on enterprises, and national income appears on neither axis. Denmark sits above the line by less than one residual standard error and behind three other states, consistent with the European pattern rather than exceptional to it.</w:t>
       </w:r>
     </w:p>
     <w:p>
@@ -727,7 +727,7 @@
           <w:i w:val="0"/>
           <w:sz w:val="24"/>
         </w:rPr>
-        <w:t xml:space="preserve"> Denmark leads Europe on citizen adoption, not on firm capability. Eurostat (2026) records that 90.86% of Danish internet users bought online in 2024, third of the twenty-seven member states, while only 38.78% of Danish enterprises make any e-sales, second in the Union behind Lithuania at 43.03% and still under two firms in five (Eurostat 2025b). Intensity rose where breadth did not: e-sales grew from 17.05% of enterprise turnover in 2014 to 33.31% in 2024, against an EU-27 average moving from 16.43% to 19.49% (Figure 5). The same split governs the newest technology. The European Commission (2026) reports that 42.03% of Danish enterprises used artificial intelligence in 2025, comprising 74.52% of large firms against 40.99% of small and medium ones, a gap of 33.53 percentage points (Figure 6). This is not a connectivity failure, since 92.45% of Danish SMEs clear the basic digital-intensity threshold against an EU average of 71.39%. What smaller firms lack is the complementary capital, namely data, systems integration and specialist staff, that converts access into application.</w:t>
+        <w:t xml:space="preserve"> Denmark leads Europe on citizen adoption, not on firm capability. Eurostat (2025b) records that 98.5% of Danish individuals aged 16 to 74 used the website or app of a public authority in 2024, the highest share in the Union against an EU-27 average of 70.0%. Firm-side adoption is not comparable: only 38.78% of Danish enterprises make any e-sales, second in the Union behind Lithuania at 43.03% and still under two firms in five (Eurostat 2025c). Intensity rose where breadth did not: e-sales grew from 17.05% of enterprise turnover in 2014 to 33.31% in 2024, against an EU-27 average moving from 16.43% to 19.49% (Figure 5). The same split governs the newest technology. The European Commission (2026) reports that 42.03% of Danish enterprises used artificial intelligence in 2025, comprising 74.52% of large firms against 40.99% of small and medium ones, a gap of 33.53 percentage points (Figure 6). This is not a connectivity failure, since 92.45% of Danish SMEs clear the basic digital-intensity threshold against an EU average of 71.39%. What smaller firms lack is the complementary capital, namely data, systems integration and specialist staff, that converts access into application.</w:t>
       </w:r>
     </w:p>
     <w:p>
@@ -1726,7 +1726,7 @@
           <w:i w:val="0"/>
           <w:sz w:val="24"/>
         </w:rPr>
-        <w:t>Eurostat 2025b, EU enterprises' online sales reach new heights, European Commission, Luxembourg, accessed 12 September 2026.</w:t>
+        <w:t>Eurostat 2025b, E-government activities of individuals via websites, dataset isoc_ciegi_ac, Eurostat, Luxembourg, accessed 14 September 2026, &lt;https://ec.europa.eu/eurostat/databrowser/view/isoc_ciegi_ac/default/table?lang=en&gt;.</w:t>
       </w:r>
     </w:p>
     <w:p>
@@ -1742,7 +1742,23 @@
           <w:i w:val="0"/>
           <w:sz w:val="24"/>
         </w:rPr>
-        <w:t>Eurostat 2025c, Share of enterprises' turnover on e-commerce (tin00110), European Commission, Luxembourg, accessed 12 September 2026.</w:t>
+        <w:t>Eurostat 2025c, EU enterprises' online sales reach new heights, European Commission, Luxembourg, accessed 12 September 2026.</w:t>
+      </w:r>
+    </w:p>
+    <w:p>
+      <w:pPr>
+        <w:spacing w:before="0" w:after="160"/>
+        <w:ind w:left="720" w:hanging="720"/>
+        <w:jc w:val="left"/>
+      </w:pPr>
+      <w:r>
+        <w:rPr>
+          <w:rFonts w:ascii="Times New Roman" w:hAnsi="Times New Roman"/>
+          <w:b w:val="0"/>
+          <w:i w:val="0"/>
+          <w:sz w:val="24"/>
+        </w:rPr>
+        <w:t>Eurostat 2025d, Share of enterprises' turnover on e-commerce (tin00110), European Commission, Luxembourg, accessed 12 September 2026.</w:t>
       </w:r>
     </w:p>
     <w:p>
@@ -1937,7 +1953,7 @@
           <w:i w:val="0"/>
           <w:sz w:val="24"/>
         </w:rPr>
-        <w:t>This appendix supports the regression reported in Question 1. The cross-section is eighteen member states holding both measures for 2024: the share of internet users who purchased online (Eurostat 2026) and e-sales as a share of enterprise turnover (Eurostat 2025c). All computation is reproducible from `02_MASTER`; the workbook computes the same statistics as live formulas on sheet `F6_ADOPT_BENEFIT`.</w:t>
+        <w:t>This appendix supports the regression reported in Question 1. The cross-section is eighteen member states holding both measures for 2024: the share of internet users who purchased online (Eurostat 2026) and e-sales as a share of enterprise turnover (Eurostat 2025d). All computation is reproducible from `02_MASTER`; the workbook computes the same statistics as live formulas on sheet `F6_ADOPT_BENEFIT`.</w:t>
       </w:r>
     </w:p>
     <w:p>

</xml_diff>

<commit_message>
Audit: fix two misreadings and one awkward contrast introduced by the last change
Question 1 read 'NemID gave way to MitID, withdrawn on 31 October 2023', which
attaches the withdrawal to MitID, the nearest noun. NemID was withdrawn.

Question 4 referred to 'the 98.5%' without naming it, relying on a figure
introduced in Question 1. The five questions are marked separately, so it now
cites Eurostat and states the value where it is used.

Question 2 opened 'Against the first place it holds on e-government use', which
buried the contrast the paragraph exists to draw, and left a high rank reading
as an achievement when the point is the low level beneath it.

Moved Question 1's warning against differencing the three banking series into
Figure 2's caption, where it costs nothing against the word limit and sits
beside the series it governs.

Body 2,183 words.

Co-Authored-By: Claude Opus 5 <noreply@anthropic.com>
Claude-Session: https://claude.ai/code/session_01Ax7AbUhZ1yD3sdczLm4auu
</commit_message>
<xml_diff>
--- a/Assignment 2 ECON1596 _ [CLASS GROUP] _ s4040040.docx
+++ b/Assignment 2 ECON1596 _ [CLASS GROUP] _ s4040040.docx
@@ -129,7 +129,7 @@
           <w:i w:val="0"/>
           <w:sz w:val="24"/>
         </w:rPr>
-        <w:t xml:space="preserve"> (Denmark 2012) made a state-run digital mailbox the default legal channel for public correspondence, binding businesses from 2013 and every citizen aged 15 and over from 1 November 2014. Table 1 dates the accompanying credential: NemID gave way to MitID, withdrawn on 31 October 2023. The combination is what distinguishes the Danish case. A mandate alone changes how letters are sent; a mandate plus a universal credential creates shared authentication infrastructure every citizen must hold and any firm may build on without financing its adoption, lowering the fixed cost of services built on it. The mandate worked as an adoption instrument: Eurostat (2025b) records that 98.5% of Danish individuals aged 16 to 74 used a public authority website or app during 2024, the highest share in the Union against an EU-27 average of 70.0%. Because compulsion accounts for that use, the economic interest lies in what others built on the same infrastructure.</w:t>
+        <w:t xml:space="preserve"> (Denmark 2012) made a state-run digital mailbox the default legal channel for public correspondence, binding businesses from 2013 and every citizen aged 15 and over from 1 November 2014. Table 1 dates the accompanying credential: MitID replaced NemID, which was withdrawn on 31 October 2023. The combination distinguishes the Danish case. A mandate alone changes how letters are sent; a mandate plus a universal credential creates authentication infrastructure every citizen must hold and any firm may build on without financing its adoption, lowering the fixed cost of services built on it. The mandate worked as an adoption instrument: Eurostat (2025b) records that 98.5% of Danish individuals aged 16 to 74 used a public authority website or app during 2024, the highest share in the Union against an EU-27 average of 70.0%. Because compulsion accounts for that use, the economic interest lies in what others built on the same infrastructure.</w:t>
       </w:r>
     </w:p>
     <w:p>
@@ -153,7 +153,7 @@
           <w:i w:val="0"/>
           <w:sz w:val="24"/>
         </w:rPr>
-        <w:t xml:space="preserve"> Finans Danmark (2025) reports that Danish retail bank branches fell from 2,025 in 2004 to 665 in 2024, a decline of 67.2% (Figure 1). Taken alone that suggests digitalisation eliminated banking employment, but the longer series qualifies it: between 1991 and 2024 financial institutions fell 76.7%, from 219 to 51, while bank employment fell only 29.4%, from roughly 51,000 to 36,000 (Figure 2). Staff per surviving institution rose from 233 to 706. The technologies doing this are online and mobile banking authenticated by MitID: with identity verification and correspondence on shared national infrastructure, branches ceased to be the distribution channel, output per institution rose and the sector consolidated rather than shed labour. The three series begin in different years and must not be differenced.</w:t>
+        <w:t xml:space="preserve"> Finans Danmark (2025) reports that Danish retail bank branches fell from 2,025 in 2004 to 665 in 2024, a decline of 67.2% (Figure 1). Taken alone that suggests digitalisation eliminated banking employment, but the longer series qualifies it: between 1991 and 2024 financial institutions fell 76.7%, from 219 to 51, while bank employment fell only 29.4%, from roughly 51,000 to 36,000 (Figure 2). Staff per surviving institution rose from 233 to 706. The technologies doing this are online and mobile banking authenticated by MitID: with identity verification and correspondence on shared national infrastructure, branches ceased to be the distribution channel, output per institution rose and the sector consolidated rather than shed labour.</w:t>
       </w:r>
     </w:p>
     <w:p>
@@ -219,7 +219,7 @@
           <w:i w:val="0"/>
           <w:sz w:val="24"/>
         </w:rPr>
-        <w:t xml:space="preserve"> Whether wider consumer adoption is associated with greater commercial activity can be tested directly. Using Eurostat (2026), Figure 4 plots the share of internet users purchasing online against e-sales as a share of enterprise turnover across the Union in 2024, the turnover measure from a separate extract (Eurostat 2025d). Across the 18 member states reporting both, the fitted slope is +0.602 percentage points of turnover per percentage point of adoption, with a standard error of 0.105 and an R² of 0.674. Appendix A reports the diagnostics. Causation is not established: adoption is measured on consumers and turnover on enterprises, and national income appears on neither axis. Denmark sits above the line by less than one residual standard error and behind three other states, consistent with the European pattern rather than exceptional to it.</w:t>
+        <w:t xml:space="preserve"> Whether wider consumer adoption is associated with greater commercial activity can be tested. Using Eurostat (2026), Figure 4 plots the share of internet users purchasing online against e-sales as a share of enterprise turnover across the Union in 2024, the turnover measure from a separate extract (Eurostat 2025d). Across the 18 member states reporting both, the fitted slope is +0.602 percentage points of turnover per percentage point of adoption, with a standard error of 0.105 and R² of 0.674. Appendix A reports the diagnostics. Causation is not established: adoption is measured on consumers and turnover on enterprises, and national income appears on neither axis. Denmark sits above the line by less than one residual standard error and behind three other states, consistent with the European pattern rather than exceptional to it.</w:t>
       </w:r>
     </w:p>
     <w:p>
@@ -648,7 +648,7 @@
           <w:i/>
           <w:sz w:val="20"/>
         </w:rPr>
-        <w:t>Figure 2. Danish banking consolidation: institutions, branches, employment; differing base years. Finans Danmark; workbook F9.</w:t>
+        <w:t>Figure 2. Danish banking consolidation: institutions, branches, employment. The three series begin in different years and must never be differenced. Finans Danmark; workbook F9.</w:t>
       </w:r>
     </w:p>
     <w:p>
@@ -797,7 +797,7 @@
           <w:i w:val="0"/>
           <w:sz w:val="24"/>
         </w:rPr>
-        <w:t xml:space="preserve"> Denmark leads Europe on citizen adoption but not on firm capability. Against the first place it holds on e-government use, only 38.78% of Danish enterprises make any e-sales, second in the Union behind Lithuania at 43.03% and still under two firms in five (Eurostat 2025c). Intensity rose where breadth did not: e-sales grew from 17.05% of enterprise turnover in 2014 to 33.31% in 2024, against an EU-27 average moving from 16.43% to 19.49% (Figure 5). The same split governs the newest technology. The European Commission (2026) reports that 42.03% of Danish enterprises used artificial intelligence in 2025, comprising 74.52% of large firms against 40.99% of small and medium ones, a gap of 33.53 percentage points (Figure 6). This is not a connectivity failure, since 92.45% of Danish SMEs clear the basic digital-intensity threshold against an EU average of 71.39%. What smaller firms lack is the complementary capital, namely data, systems integration and specialist staff, that converts access into application.</w:t>
+        <w:t xml:space="preserve"> Denmark leads Europe on citizen adoption but not on firm capability. Its citizens rank first in the Union on e-government use; its firms rank second on e-sales and still only 38.78% of them make any, behind Lithuania at 43.03% and under two firms in five (Eurostat 2025c). A high rank on a low level is the problem, not the achievement. Intensity rose where breadth did not: e-sales grew from 17.05% of enterprise turnover in 2014 to 33.31% in 2024, against an EU-27 average moving from 16.43% to 19.49% (Figure 5). The same split governs the newest technology. The European Commission (2026) reports that 42.03% of Danish enterprises used artificial intelligence in 2025, comprising 74.52% of large firms against 40.99% of small and medium ones, a gap of 33.53 percentage points (Figure 6). This is not a connectivity failure, since 92.45% of Danish SMEs clear the basic digital-intensity threshold against an EU average of 71.39%. What smaller firms lack is the complementary capital, namely data, systems integration and specialist staff, that converts access into application.</w:t>
       </w:r>
     </w:p>
     <w:p>
@@ -1319,7 +1319,7 @@
           <w:i w:val="0"/>
           <w:sz w:val="24"/>
         </w:rPr>
-        <w:t xml:space="preserve"> The measure on which Denmark ranks first is the one least able to detect this problem. The Eurostat survey behind the 98.5% asks only whether a person interacted online at all, once, in twelve months: it records reach, and is silent on whether the attempt succeeded or was made independently (Figure 8). In the first quarter of 2026, 4.7% of citizens aged 15 and over, or 238,479 people, were exempt, the narrowest available measure of the problem; Figure 9 sets it against four wider estimates that are not comparable because measure, year and denominator all differ, and Appendix C reconciles them. The European Commission (2026) reports that 6.5% of Danes do not use digital public services and 16.5% report difficulty using them, while Digitaliseringsstyrelsen (2025c) and Justitia (2022) put the widest estimates at about a quarter of adults. The counts are clearer than the percentages: 16.5% of 6,025,603 (Danmarks Statistik 2026) is roughly 994,000 against 238,479 exempt, so on the order of three-quarters of a million Danes struggle with a compulsory system while holding no standing outside it.</w:t>
+        <w:t xml:space="preserve"> The measure on which Denmark ranks first is the one least able to detect this problem. Eurostat (2025b) puts Danish e-government use at 98.5%, but the survey asks only whether a person interacted online at all, once, in twelve months: it records reach, and is silent on whether the attempt succeeded or was made independently (Figure 8). In the first quarter of 2026, 4.7% of citizens aged 15 and over, or 238,479 people, were exempt, the narrowest available measure of the problem; Figure 9 sets it against four wider estimates that are not comparable because measure, year and denominator all differ, and Appendix C reconciles them. The European Commission (2026) reports that 6.5% of Danes do not use digital public services and 16.5% report difficulty using them, while Digitaliseringsstyrelsen (2025c) and Justitia (2022) put the widest estimates at about a quarter of adults. The counts are clearer than the percentages: 16.5% of 6,025,603 (Danmarks Statistik 2026) is roughly 994,000 against 238,479 exempt, so on the order of three-quarters of a million Danes struggle with a compulsory system while holding no standing outside it.</w:t>
       </w:r>
     </w:p>
     <w:p>

</xml_diff>

<commit_message>
Rewrite report body as continuous prose
The word budget had been spent entirely on evidence, leaving 17 words of
headroom and no room for the connective tissue that makes an argument
readable. Three consequences: bold run-in labels doing the work of
transitions, two-decimal precision on survey percentages, and claims
landing without topic sentences.

Traded evidence for prose at constant length:
- opening framing for each question, transitions between paragraphs
- bold labels kept only where the marking criteria name the component
  (Effectiveness, Weaknesses, Recommended improvement)
- survey percentages rounded to whole points in prose; the workbook and
  figures retain full precision
- Q4's five-estimate reconciliation reordered narrowest to widest

Verifiers unchanged and passing: 1,883 workbook, 1,830 docx.
2,199 words, 27 references, all citations intact.

Co-Authored-By: Claude Opus 5 <noreply@anthropic.com>
Claude-Session: https://claude.ai/code/session_01Ax7AbUhZ1yD3sdczLm4auu
</commit_message>
<xml_diff>
--- a/Assignment 2 ECON1596 _ [CLASS GROUP] _ s4040040.docx
+++ b/Assignment 2 ECON1596 _ [CLASS GROUP] _ s4040040.docx
@@ -111,7 +111,7 @@
           <w:i w:val="0"/>
           <w:sz w:val="24"/>
         </w:rPr>
-        <w:t xml:space="preserve">Denmark did not persuade its citizens to adopt digital public services; it required them to do so. </w:t>
+        <w:t xml:space="preserve">Denmark's digital transformation began with an obligation rather than an invitation, and that origin explains both its speed and its shape. </w:t>
       </w:r>
       <w:r>
         <w:rPr>
@@ -129,7 +129,7 @@
           <w:i w:val="0"/>
           <w:sz w:val="24"/>
         </w:rPr>
-        <w:t xml:space="preserve"> (Denmark 2012) made a state-run digital mailbox the default legal channel for public correspondence, binding businesses from 2013 and every citizen aged 15 and over from 1 November 2014. Table 1 dates the accompanying credential: MitID replaced NemID, which was withdrawn on 31 October 2023. The combination distinguishes the Danish case. A mandate alone changes how letters are sent; a mandate plus a universal credential creates authentication infrastructure every citizen must hold and any firm may build on without financing its adoption, lowering the fixed cost of services built on it. The mandate worked as an adoption instrument: Eurostat (2026a) records that 98.5% of Danish individuals aged 16 to 74 used a public authority website or app during 2024, the highest share in the Union against an EU-27 average of 70.0%. Because compulsion accounts for that use, the economic interest lies in what others built on the same infrastructure.</w:t>
+        <w:t xml:space="preserve"> (Denmark 2012) made a state-run digital mailbox the default legal channel for public correspondence, binding businesses from 2013 and every citizen aged 15 and over from 1 November 2014. Alongside it came a universal electronic credential, dated in Table 1.</w:t>
       </w:r>
     </w:p>
     <w:p>
@@ -137,15 +137,6 @@
         <w:spacing w:before="0" w:after="120"/>
         <w:jc w:val="both"/>
       </w:pPr>
-      <w:r>
-        <w:rPr>
-          <w:rFonts w:ascii="Times New Roman" w:hAnsi="Times New Roman"/>
-          <w:b/>
-          <w:i w:val="0"/>
-          <w:sz w:val="24"/>
-        </w:rPr>
-        <w:t>Retail banking.</w:t>
-      </w:r>
       <w:r>
         <w:rPr>
           <w:rFonts w:ascii="Times New Roman" w:hAnsi="Times New Roman"/>
@@ -153,7 +144,7 @@
           <w:i w:val="0"/>
           <w:sz w:val="24"/>
         </w:rPr>
-        <w:t xml:space="preserve"> Finans Danmark (2025) reports that Danish retail bank branches fell from 2,025 in 2004 to 665 in 2024, a decline of 67.2% (Figure 1). Taken alone that suggests digitalisation eliminated banking employment, but the longer series qualifies it: between 1991 and 2024 financial institutions fell 76.7%, from 219 to 51, while bank employment fell only 29.4%, from roughly 51,000 to 36,000 (Figure 2). Staff per surviving institution rose from 233 to 706. The technologies doing this are online and mobile banking authenticated by MitID: with identity verification and correspondence on shared national infrastructure, branches ceased to be the distribution channel, output per institution rose and the sector consolidated rather than shed labour.</w:t>
+        <w:t>The combination is what distinguishes the Danish case. A mandate alone changes how letters are sent. A mandate joined to a universal credential creates authentication infrastructure that every citizen must hold and any firm may build upon without financing its adoption. That lowers the fixed cost of every service built on top of it. As an adoption instrument it worked: Eurostat (2026a) records that 98.5% of Danish individuals aged 16 to 74 used a public authority website or app during 2024, the highest share in the Union against an EU-27 average of 70%. Because compulsion accounts for that use, the economic interest lies not in the adoption but in what private industry built on the same foundation. Two sectors show the pattern.</w:t>
       </w:r>
     </w:p>
     <w:p>
@@ -161,15 +152,6 @@
         <w:spacing w:before="0" w:after="120"/>
         <w:jc w:val="both"/>
       </w:pPr>
-      <w:r>
-        <w:rPr>
-          <w:rFonts w:ascii="Times New Roman" w:hAnsi="Times New Roman"/>
-          <w:b/>
-          <w:i w:val="0"/>
-          <w:sz w:val="24"/>
-        </w:rPr>
-        <w:t>Retail payments.</w:t>
-      </w:r>
       <w:r>
         <w:rPr>
           <w:rFonts w:ascii="Times New Roman" w:hAnsi="Times New Roman"/>
@@ -177,17 +159,14 @@
           <w:i w:val="0"/>
           <w:sz w:val="24"/>
         </w:rPr>
-        <w:t xml:space="preserve"> Danmarks Nationalbank (2025) reports that cash fell from 23% to 9% of the </w:t>
+        <w:t>Retail banking consolidated rather than contracted. Finans Danmark (2025) reports that branches fell from 2,025 in 2004 to 665 in 2024, a decline of 67% (Figure 1). Taken alone that would suggest digitalisation destroyed banking employment, but the longer series qualifies it. Between 1991 and 2024 institutions fell by 77%, from 219 to 51, while employment fell by only 29%, from roughly 51,000 to 36,000 (Figure 2), so staff per surviving institution rose from 233 to 706. The technologies behind this are online and mobile banking authenticated by MitID. Once identity and correspondence moved onto shared national infrastructure, the branch ceased to be the distribution channel, output per institution rose, and the sector shed premises rather than labour.</w:t>
       </w:r>
-      <w:r>
-        <w:rPr>
-          <w:rFonts w:ascii="Times New Roman" w:hAnsi="Times New Roman"/>
-          <w:b w:val="0"/>
-          <w:i/>
-          <w:sz w:val="24"/>
-        </w:rPr>
-        <w:t>number</w:t>
-      </w:r>
+    </w:p>
+    <w:p>
+      <w:pPr>
+        <w:spacing w:before="0" w:after="120"/>
+        <w:jc w:val="both"/>
+      </w:pPr>
       <w:r>
         <w:rPr>
           <w:rFonts w:ascii="Times New Roman" w:hAnsi="Times New Roman"/>
@@ -195,7 +174,7 @@
           <w:i w:val="0"/>
           <w:sz w:val="24"/>
         </w:rPr>
-        <w:t xml:space="preserve"> of payments in physical retail between 2017 and 2025, while card-based mobile wallets reached 32% of the same measure (Figure 3). Much of this is displacement within digital instruments rather than new digitalisation, because wallet payments are card payments and the physical card share fell from 73% to 54%. What changed was the interface, not the rails underneath, which is the kind of innovation shared infrastructure makes cheap to attempt.</w:t>
+        <w:t>Retail payments show innovation of a different kind. Danmarks Nationalbank (2025) reports that cash fell from 23% to 9% of the number of payments made in physical retail between 2017 and 2025, while card-based mobile wallets reached 32% of the same measure (Figure 3). Much of this is displacement within digital instruments rather than fresh digitalisation, because a wallet payment is a card payment and the physical card share fell from 73% to 54%. What changed was the interface rather than the rails beneath it, the kind of incremental innovation that shared infrastructure makes cheap to attempt.</w:t>
       </w:r>
     </w:p>
     <w:p>
@@ -203,15 +182,6 @@
         <w:spacing w:before="0" w:after="120"/>
         <w:jc w:val="both"/>
       </w:pPr>
-      <w:r>
-        <w:rPr>
-          <w:rFonts w:ascii="Times New Roman" w:hAnsi="Times New Roman"/>
-          <w:b/>
-          <w:i w:val="0"/>
-          <w:sz w:val="24"/>
-        </w:rPr>
-        <w:t>Broader economic effect.</w:t>
-      </w:r>
       <w:r>
         <w:rPr>
           <w:rFonts w:ascii="Times New Roman" w:hAnsi="Times New Roman"/>
@@ -219,7 +189,7 @@
           <w:i w:val="0"/>
           <w:sz w:val="24"/>
         </w:rPr>
-        <w:t xml:space="preserve"> Whether wider consumer adoption is associated with greater commercial activity can be tested. Using Eurostat (2026b), Figure 4 plots the share of internet users purchasing online against e-sales as a share of enterprise turnover across the Union in 2024, the turnover measure from a separate extract (Eurostat 2025c). Across the 18 member states reporting both, the fitted slope is +0.602 percentage points of turnover per percentage point of adoption, with a standard error of 0.105 and R² of 0.674. Appendix A reports the diagnostics. Causation is not established: adoption is measured on consumers and turnover on enterprises, and national income appears on neither axis. Denmark sits above the line by less than one residual standard error and behind three other states, consistent with the European pattern rather than exceptional to it.</w:t>
+        <w:t>Whether wider consumer adoption is associated with greater commercial activity can be tested directly. Using Eurostat (2026b), Figure 4 plots the share of internet users purchasing online against e-sales as a share of enterprise turnover across the Union in 2024, turnover from a separate extract (Eurostat 2025c). Across the 18 member states reporting both, the fitted slope is +0.60 percentage points of turnover per percentage point of adoption, with an R² of 0.674 and diagnostics in Appendix A. Causation is not established: adoption is measured on consumers and turnover on enterprises, and national income appears on neither axis. Denmark sits above the line by less than one residual standard error, within the European pattern rather than outside it.</w:t>
       </w:r>
     </w:p>
     <w:p>
@@ -784,12 +754,18 @@
       <w:r>
         <w:rPr>
           <w:rFonts w:ascii="Times New Roman" w:hAnsi="Times New Roman"/>
-          <w:b/>
+          <w:b w:val="0"/>
           <w:i w:val="0"/>
           <w:sz w:val="24"/>
         </w:rPr>
-        <w:t>The problem both policies address.</w:t>
+        <w:t>Denmark's difficulty is not getting technology to its firms but getting value out of it once it arrives, and both policies here address that gap. Its citizens rank first in the Union on e-government use, yet its firms rank second on e-sales while only 39% make any, behind Lithuania at 43% (Eurostat 2025b). A high rank on a low level is the problem rather than the achievement.</w:t>
       </w:r>
+    </w:p>
+    <w:p>
+      <w:pPr>
+        <w:spacing w:before="0" w:after="120"/>
+        <w:jc w:val="both"/>
+      </w:pPr>
       <w:r>
         <w:rPr>
           <w:rFonts w:ascii="Times New Roman" w:hAnsi="Times New Roman"/>
@@ -797,7 +773,7 @@
           <w:i w:val="0"/>
           <w:sz w:val="24"/>
         </w:rPr>
-        <w:t xml:space="preserve"> Denmark leads Europe on citizen adoption but not on firm capability. Its citizens rank first in the Union on e-government use; its firms rank second on e-sales and still only 38.78% of them make any, behind Lithuania at 43.03% and under two firms in five (Eurostat 2025b). A high rank on a low level is the problem, not the achievement. Intensity rose where breadth did not: e-sales grew from 17.05% of enterprise turnover in 2014 to 33.31% in 2024, against an EU-27 average moving from 16.43% to 19.49% (Figure 5). The same split governs the newest technology. The European Commission (2026) reports that 42.03% of Danish enterprises used artificial intelligence in 2025, comprising 74.52% of large firms against 40.99% of small and medium ones, a gap of 33.53 percentage points (Figure 6). This is not a connectivity failure, since 92.45% of Danish SMEs clear the basic digital-intensity threshold against an EU average of 71.39%. What smaller firms lack is the complementary capital, namely data, systems integration and specialist staff, that converts access into application.</w:t>
+        <w:t>Intensity has risen where breadth has not. E-sales grew from 17% of enterprise turnover in 2014 to 33% in 2024, against an EU-27 average moving from 16% to 19% (Figure 5): the firms that do sell online depend on it heavily, while the majority still do not sell online at all. The newest technology divides along the same line. The European Commission (2026) reports that 42% of Danish enterprises used artificial intelligence in 2025, comprising 75% of large firms against 41% of small and medium ones (Figure 6). This is not a connectivity failure, since 92% of Danish SMEs clear the basic digital-intensity threshold against an EU average of 71%. What they lack is the complementary capital, namely data, systems integration and specialist staff, that converts access into application.</w:t>
       </w:r>
     </w:p>
     <w:p>
@@ -805,15 +781,6 @@
         <w:spacing w:before="0" w:after="120"/>
         <w:jc w:val="both"/>
       </w:pPr>
-      <w:r>
-        <w:rPr>
-          <w:rFonts w:ascii="Times New Roman" w:hAnsi="Times New Roman"/>
-          <w:b/>
-          <w:i w:val="0"/>
-          <w:sz w:val="24"/>
-        </w:rPr>
-        <w:t>The two instruments.</w:t>
-      </w:r>
       <w:r>
         <w:rPr>
           <w:rFonts w:ascii="Times New Roman" w:hAnsi="Times New Roman"/>
@@ -821,7 +788,7 @@
           <w:i w:val="0"/>
           <w:sz w:val="24"/>
         </w:rPr>
-        <w:t xml:space="preserve"> Denmark's SMV:Digital and Germany's </w:t>
+        <w:t xml:space="preserve">Denmark's SMV:Digital and Germany's </w:t>
       </w:r>
       <w:r>
         <w:rPr>
@@ -839,7 +806,7 @@
           <w:i w:val="0"/>
           <w:sz w:val="24"/>
         </w:rPr>
-        <w:t xml:space="preserve"> share an objective, to raise digital investment among firms that would not otherwise make it, and both are co-financed grants to small and medium enterprises. They differ in how they choose recipients. SMV:Digital scores applications and funds the highest scorers until the pool is exhausted, the next pool opening on 26 October 2026 (SMV:Digital 2026); </w:t>
+        <w:t xml:space="preserve"> were both built for this purpose. Both are co-financed grants to small and medium enterprises meant to raise digital investment among firms that would not otherwise make it, differing in how they choose recipients. SMV:Digital scores applications and funds the highest scorers until the pool is exhausted (SMV:Digital 2026); </w:t>
       </w:r>
       <w:r>
         <w:rPr>
@@ -899,7 +866,7 @@
           <w:i w:val="0"/>
           <w:sz w:val="24"/>
         </w:rPr>
-        <w:t>, and its allocation rule drew an objection Denmark's does not face: the Bundesrechnungshof (2022) criticised awarding the funding by lottery rather than on criteria, warning that firms would postpone investment while waiting for a favourable draw, and called for the procedure to be discontinued. A lottery makes the grant a prize worth waiting for, and waiting is the opposite of what the scheme exists to produce.</w:t>
+        <w:t>, whose allocation rule drew an objection Denmark's does not face. The Bundesrechnungshof (2022) criticised awarding funding by lottery rather than on criteria, warning that firms would postpone investment while awaiting a favourable draw, and called for the procedure to be discontinued. A lottery makes the grant a prize worth waiting for, and waiting is the opposite of what the scheme exists to produce.</w:t>
       </w:r>
     </w:p>
     <w:p>
@@ -914,7 +881,7 @@
           <w:i w:val="0"/>
           <w:sz w:val="24"/>
         </w:rPr>
-        <w:t>Weaknesses and implementation challenges.</w:t>
+        <w:t>Weaknesses.</w:t>
       </w:r>
       <w:r>
         <w:rPr>
@@ -923,7 +890,7 @@
           <w:i w:val="0"/>
           <w:sz w:val="24"/>
         </w:rPr>
-        <w:t xml:space="preserve"> Denmark's advantage is narrower than it appears. Matching addresses selection on what the registers record, namely sector, size, age and prior trajectory, and not on what they do not. Selection into a voluntary scheme runs on managerial ambition and the slack to write an application, the traits that also produce revenue growth, so the matched estimate retains an upward bias of unknown size. Neither scheme reaches firms that never apply.</w:t>
+        <w:t xml:space="preserve"> Denmark's advantage is narrower than it appears. Matching addresses selection on what the registers record, namely sector, size, age and prior trajectory, and not on what they do not. Selection into a voluntary scheme runs on managerial ambition and the slack to write an application, traits that independently produce revenue growth, so the matched estimate retains an upward bias of unknown size. Neither scheme reaches the firms that never apply.</w:t>
       </w:r>
     </w:p>
     <w:p>
@@ -947,7 +914,7 @@
           <w:i w:val="0"/>
           <w:sz w:val="24"/>
         </w:rPr>
-        <w:t xml:space="preserve"> SMV:Digital already scores applicants, so it already produces a funding threshold; it simply discards the information. Near the cut-off, whether a firm is funded turns on assessor variation rather than on the firm, which makes applicants just above and just below comparable on exactly the unobservables that defeat matching. Retaining the scores and publishing the cut-off would allow a regression discontinuity estimate at administrative cost only (Appendix B).</w:t>
+        <w:t xml:space="preserve"> The remedy is latent in the Danish design. SMV:Digital scores its applicants, so it already produces a funding threshold; it simply discards the information afterwards. Near that cut-off, funding turns on assessor variation rather than on the firm, which makes applicants just above and just below comparable on precisely the unobservables that defeat matching. Retaining the scores and publishing the cut-off would permit a regression discontinuity estimate at administrative cost alone (Appendix B).</w:t>
       </w:r>
     </w:p>
     <w:p>
@@ -1087,7 +1054,7 @@
           <w:i w:val="0"/>
           <w:sz w:val="24"/>
         </w:rPr>
-        <w:t>Sustainable Development Goal 12, on responsible consumption and production, is the goal Danish digitalisation has most clearly moved, and it has moved it in both directions. Digital infrastructure substitutes information for materials at the point of use and creates a new material stream at disposal. Denmark is unusually far along the first and far behind on the second.</w:t>
+        <w:t>Sustainable Development Goal 12, on responsible consumption and production, is the goal Danish digitalisation has most clearly moved, and it has moved it in both directions at once. Digital infrastructure substitutes information for materials at the point of use, and creates a new material stream at disposal. Denmark is unusually far along the first and far behind on the second.</w:t>
       </w:r>
     </w:p>
     <w:p>
@@ -1095,15 +1062,6 @@
         <w:spacing w:before="0" w:after="120"/>
         <w:jc w:val="both"/>
       </w:pPr>
-      <w:r>
-        <w:rPr>
-          <w:rFonts w:ascii="Times New Roman" w:hAnsi="Times New Roman"/>
-          <w:b/>
-          <w:i w:val="0"/>
-          <w:sz w:val="24"/>
-        </w:rPr>
-        <w:t>Positive contribution.</w:t>
-      </w:r>
       <w:r>
         <w:rPr>
           <w:rFonts w:ascii="Times New Roman" w:hAnsi="Times New Roman"/>
@@ -1111,7 +1069,7 @@
           <w:i w:val="0"/>
           <w:sz w:val="24"/>
         </w:rPr>
-        <w:t xml:space="preserve"> The mandate's audited benefit is a dematerialisation benefit. Rigsrevisionen (2016) could verify roughly DKK 450 million a year of the projected saving from compulsory Digital Post, and the verified component is precisely postage, paper and envelopes. That is a financial figure rather than a tonnage, so it prices the paper avoided rather than weighing it, but the substitution covers correspondence with every adult in the country. Payments show the same substitution privately: cash fell from 23% to 9% of physical retail payments between 2017 and 2025 (Danmarks Nationalbank 2025). That is a share rather than a volume, so it establishes the direction of the substitution and not its quantity.</w:t>
+        <w:t>The positive contribution is a dematerialisation benefit, and it has been audited. Rigsrevisionen (2016) could verify roughly DKK 450 million a year of the saving projected from compulsory Digital Post, and the component verified is precisely postage, paper and envelopes. That prices the paper avoided rather than weighing it, but the substitution covers correspondence with every adult in the country. Private payments show the same substitution: cash fell from 23% to 9% of physical retail payments between 2017 and 2025 (Danmarks Nationalbank 2025), a share rather than a volume, which establishes direction without quantity.</w:t>
       </w:r>
     </w:p>
     <w:p>
@@ -1119,15 +1077,6 @@
         <w:spacing w:before="0" w:after="120"/>
         <w:jc w:val="both"/>
       </w:pPr>
-      <w:r>
-        <w:rPr>
-          <w:rFonts w:ascii="Times New Roman" w:hAnsi="Times New Roman"/>
-          <w:b/>
-          <w:i w:val="0"/>
-          <w:sz w:val="24"/>
-        </w:rPr>
-        <w:t>The remaining challenge.</w:t>
-      </w:r>
       <w:r>
         <w:rPr>
           <w:rFonts w:ascii="Times New Roman" w:hAnsi="Times New Roman"/>
@@ -1135,7 +1084,7 @@
           <w:i w:val="0"/>
           <w:sz w:val="24"/>
         </w:rPr>
-        <w:t xml:space="preserve"> Denmark performs the disposal side badly. The European Commission (2026) reports that Denmark recycled or prepared for reuse 15.37% of the ICT waste it collected in 2023, against an EU-27 average of 80.23%, a gap of roughly 65 percentage points (Figure 7). The denominator matters and narrows the claim: the base is ICT waste </w:t>
+        <w:t xml:space="preserve">Against this, Denmark performs the disposal side of the same goal badly. The European Commission (2026) reports that it recycled or prepared for reuse 15% of the ICT waste collected in 2023, against an EU-27 average of 80%, a gap of some 65 percentage points (Figure 7). The denominator narrows the claim: the base is ICT waste </w:t>
       </w:r>
       <w:r>
         <w:rPr>
@@ -1153,7 +1102,7 @@
           <w:i w:val="0"/>
           <w:sz w:val="24"/>
         </w:rPr>
-        <w:t>, so the indicator describes what happens to devices that reach the waste stream and is silent on how many never do. On the measure that exists, a country at or near the top of the Union on almost every digital indicator sits near the bottom on this one.</w:t>
+        <w:t>, so the indicator describes what happens to devices that reach the waste stream and is silent on how many never do. No trend accompanies it either, the source publishing a single year, which makes 15% a level rather than a direction. On the measure that does exist, a country at or near the top of the Union on almost every digital indicator sits near the bottom on this one.</w:t>
       </w:r>
     </w:p>
     <w:p>
@@ -1161,15 +1110,6 @@
         <w:spacing w:before="0" w:after="120"/>
         <w:jc w:val="both"/>
       </w:pPr>
-      <w:r>
-        <w:rPr>
-          <w:rFonts w:ascii="Times New Roman" w:hAnsi="Times New Roman"/>
-          <w:b/>
-          <w:i w:val="0"/>
-          <w:sz w:val="24"/>
-        </w:rPr>
-        <w:t>Indicator trend.</w:t>
-      </w:r>
       <w:r>
         <w:rPr>
           <w:rFonts w:ascii="Times New Roman" w:hAnsi="Times New Roman"/>
@@ -1177,31 +1117,7 @@
           <w:i w:val="0"/>
           <w:sz w:val="24"/>
         </w:rPr>
-        <w:t xml:space="preserve"> No trend can be reported. The source publishes a single year for this indicator, so 15.37% is a level and not a direction, and no claim is made about whether Danish performance is improving.</w:t>
-      </w:r>
-    </w:p>
-    <w:p>
-      <w:pPr>
-        <w:spacing w:before="0" w:after="120"/>
-        <w:jc w:val="both"/>
-      </w:pPr>
-      <w:r>
-        <w:rPr>
-          <w:rFonts w:ascii="Times New Roman" w:hAnsi="Times New Roman"/>
-          <w:b/>
-          <w:i w:val="0"/>
-          <w:sz w:val="24"/>
-        </w:rPr>
-        <w:t>What this implies.</w:t>
-      </w:r>
-      <w:r>
-        <w:rPr>
-          <w:rFonts w:ascii="Times New Roman" w:hAnsi="Times New Roman"/>
-          <w:b w:val="0"/>
-          <w:i w:val="0"/>
-          <w:sz w:val="24"/>
-        </w:rPr>
-        <w:t xml:space="preserve"> The two halves are connected by the same policy. A mandate requiring every adult to transact digitally also requires every adult to hold a device capable of running MitID, and that obligation was justified on an administrative saving alone. The environmental case for Danish digitalisation has been made on dematerialisation; the circularity side of the same goal is where its measured performance is weakest.</w:t>
+        <w:t>The two halves are connected by the same policy, which makes the contrast more than coincidence. A mandate requiring every adult to transact digitally also requires every adult to hold a device capable of running MitID, and that obligation was justified on an administrative saving alone. The environmental case for Danish digitalisation has been made on dematerialisation; the circularity side of the same goal is where its measured performance is weakest.</w:t>
       </w:r>
     </w:p>
     <w:p>
@@ -1282,12 +1198,18 @@
       <w:r>
         <w:rPr>
           <w:rFonts w:ascii="Times New Roman" w:hAnsi="Times New Roman"/>
-          <w:b/>
+          <w:b w:val="0"/>
           <w:i w:val="0"/>
           <w:sz w:val="24"/>
         </w:rPr>
-        <w:t>The group and the policy.</w:t>
+        <w:t>A mandate binding every adult falls most heavily on those least able to comply, and the only relief available to them is statutory exemption from Digital Post. The scale of that relief among the oldest citizens indicates the difficulty: Digitaliseringsstyrelsen (2026) reports that nearly one citizen in five aged 75 to 84 holds a formal exemption, rising to roughly one in three among those aged 85 and over.</w:t>
       </w:r>
+    </w:p>
+    <w:p>
+      <w:pPr>
+        <w:spacing w:before="0" w:after="120"/>
+        <w:jc w:val="both"/>
+      </w:pPr>
       <w:r>
         <w:rPr>
           <w:rFonts w:ascii="Times New Roman" w:hAnsi="Times New Roman"/>
@@ -1295,7 +1217,7 @@
           <w:i w:val="0"/>
           <w:sz w:val="24"/>
         </w:rPr>
-        <w:t xml:space="preserve"> The mandate falls most heavily on the oldest citizens, whose only relief is statutory exemption from Digital Post. Digitaliseringsstyrelsen (2026) reports that nearly one citizen in five aged 75 to 84 holds a formal exemption, rising to roughly one in three among those 85 and over. Those are 2022 figures against a 2026 rate below, so the two are complementary rather than points on a trend.</w:t>
+        <w:t>The measure on which Denmark ranks first is the one least able to detect this. Eurostat (2026a) puts Danish e-government use at 98.5%, but the survey asks only whether a person interacted online at all, once, in twelve months. It records reach, and says nothing about whether the attempt succeeded or was made independently (Figure 8).</w:t>
       </w:r>
     </w:p>
     <w:p>
@@ -1303,15 +1225,6 @@
         <w:spacing w:before="0" w:after="120"/>
         <w:jc w:val="both"/>
       </w:pPr>
-      <w:r>
-        <w:rPr>
-          <w:rFonts w:ascii="Times New Roman" w:hAnsi="Times New Roman"/>
-          <w:b/>
-          <w:i w:val="0"/>
-          <w:sz w:val="24"/>
-        </w:rPr>
-        <w:t>Effectiveness, and what the headline conceals.</w:t>
-      </w:r>
       <w:r>
         <w:rPr>
           <w:rFonts w:ascii="Times New Roman" w:hAnsi="Times New Roman"/>
@@ -1319,7 +1232,7 @@
           <w:i w:val="0"/>
           <w:sz w:val="24"/>
         </w:rPr>
-        <w:t xml:space="preserve"> The measure on which Denmark ranks first is the one least able to detect this problem. Eurostat (2026a) puts Danish e-government use at 98.5%, but the survey asks only whether a person interacted online at all, once, in twelve months: it records reach, and is silent on whether the attempt succeeded or was made independently (Figure 8). In the first quarter of 2026, 4.7% of citizens aged 15 and over, or 238,479 people, were exempt, the narrowest available measure of the problem; Figure 9 sets it against four wider estimates that are not comparable because measure, year and denominator all differ, and Appendix C reconciles them. The European Commission (2026) reports that 6.5% of Danes do not use digital public services and 16.5% report difficulty using them, while Digitaliseringsstyrelsen (2025c) and Justitia (2022) put the widest estimates at about a quarter of adults. The counts are clearer than the percentages: 16.5% of 6,025,603 (Danmarks Statistik 2026) is roughly 994,000 against 238,479 exempt, so on the order of three-quarters of a million Danes struggle with a compulsory system while holding no standing outside it.</w:t>
+        <w:t>Measuring the problem instead of the reach means choosing between estimates that do not agree. The narrowest is exemption itself: in the first quarter of 2026, 4.7% of citizens aged 15 and over, or 238,479 people, held one. The European Commission (2026) reports that 16.5% of Danes have difficulty using digital public services, while Digitaliseringsstyrelsen (2025c) and Justitia (2022) put the widest estimates at about a quarter of adults. These are not points on a scale, since measure, year and denominator all differ; Figure 9 sets them side by side and Appendix C reconciles them. The counts are clearer than the percentages. Against a population of 6,025,603 (Danmarks Statistik 2026), 16.5% is roughly 994,000 people to 238,479 exempt, so on the order of three-quarters of a million Danes struggle with a compulsory system while holding no standing outside it.</w:t>
       </w:r>
     </w:p>
     <w:p>
@@ -1327,15 +1240,6 @@
         <w:spacing w:before="0" w:after="120"/>
         <w:jc w:val="both"/>
       </w:pPr>
-      <w:r>
-        <w:rPr>
-          <w:rFonts w:ascii="Times New Roman" w:hAnsi="Times New Roman"/>
-          <w:b/>
-          <w:i w:val="0"/>
-          <w:sz w:val="24"/>
-        </w:rPr>
-        <w:t>The barrier is administrative, not a skills deficit.</w:t>
-      </w:r>
       <w:r>
         <w:rPr>
           <w:rFonts w:ascii="Times New Roman" w:hAnsi="Times New Roman"/>
@@ -1343,7 +1247,7 @@
           <w:i w:val="0"/>
           <w:sz w:val="24"/>
         </w:rPr>
-        <w:t xml:space="preserve"> Denmark's weakest age band, those aged 55 to 74, reaches 67.81% with at least basic digital skills against an EU average of 42.60%, and leads the Union in all three bands (Figure 10). The mandate is calibrated above the bottom of its own distribution, and the exemption criteria are drawn more narrowly than the difficulty they relieve.</w:t>
+        <w:t>That gap is administrative rather than a skills deficit, and the skills data make the point. Denmark's weakest age band, those aged 55 to 74, reaches 68% with at least basic digital skills against an EU average of 43%, and Denmark leads the Union in all three bands (Figure 10). The mandate is calibrated above the bottom of its own distribution, and the exemption criteria are drawn more narrowly than the difficulty they exist to relieve.</w:t>
       </w:r>
     </w:p>
     <w:p>
@@ -1351,15 +1255,6 @@
         <w:spacing w:before="0" w:after="120"/>
         <w:jc w:val="both"/>
       </w:pPr>
-      <w:r>
-        <w:rPr>
-          <w:rFonts w:ascii="Times New Roman" w:hAnsi="Times New Roman"/>
-          <w:b/>
-          <w:i w:val="0"/>
-          <w:sz w:val="24"/>
-        </w:rPr>
-        <w:t>Recommendation.</w:t>
-      </w:r>
       <w:r>
         <w:rPr>
           <w:rFonts w:ascii="Times New Roman" w:hAnsi="Times New Roman"/>
@@ -1367,7 +1262,7 @@
           <w:i w:val="0"/>
           <w:sz w:val="24"/>
         </w:rPr>
-        <w:t xml:space="preserve"> The exemption criteria should be widened to admit documented difficulty rather than only the listed statutory grounds. Denmark has already solved the adjacent problem: Folketinget (2023) provided that from June 2023 an exempt citizen is entitled, on request, to a non-digital alternative to any mandatory self-service solution. That decoupled the channel from the obligation but left the qualifying criteria untouched, because the right runs only to those already exempt. The Conseil d'État (2022) and the Belgian Cour constitutionnelle (2025) have since attached the entitlement to the difficulty rather than to a prior status (Appendix D).</w:t>
+        <w:t>The criteria should accordingly be widened to admit documented difficulty rather than only the listed statutory grounds. Denmark has solved the adjacent problem: Folketinget (2023) provided that from June 2023 an exempt citizen is entitled, on request, to a non-digital alternative to any mandatory self-service solution. That decoupled the channel from the obligation but left the qualifying criteria untouched, because the right runs only to those already exempt. The Conseil d'État (2022) and the Belgian Cour constitutionnelle (2025) have since attached the equivalent entitlement to the difficulty itself rather than to a prior status (Appendix D).</w:t>
       </w:r>
     </w:p>
     <w:p>
@@ -1562,7 +1457,7 @@
           <w:i w:val="0"/>
           <w:sz w:val="24"/>
         </w:rPr>
-        <w:t>The session addressed corporate sustainability at PwC rather than digital government, and the connection to Denmark was not one I expected. It rests on an idea running through both halves of the talk: adoption is easy to claim and effect is hard to prove, and what separates them is who does the measuring.</w:t>
+        <w:t>The session addressed corporate sustainability at PwC rather than digital government, so the connection to Denmark was not the one I expected. It rests on an idea running through both halves of the talk: adoption is easy to claim and effect is hard to prove, and what separates them is who does the measuring.</w:t>
       </w:r>
     </w:p>
     <w:p>
@@ -1577,7 +1472,7 @@
           <w:i w:val="0"/>
           <w:sz w:val="24"/>
         </w:rPr>
-        <w:t>Tran (2026) reported that in a PwC survey of Asia-Pacific chief executives, 82% had adopted generative artificial intelligence within five years while far fewer could identify revenue attributable to it. Denmark shows the same gap. Adoption is high by European standards at 42.03% of enterprises and it is concentrated, 74.52% of large firms against 40.99% of small and medium ones. Access has been distributed and capability has not, which is the finding Question 2 reaches from Danish evidence and the guest speaker reached from a regional survey.</w:t>
+        <w:t>Tran (2026) reported that in a PwC survey of Asia-Pacific chief executives, 82% had adopted generative artificial intelligence within five years while far fewer could identify revenue attributable to it. Denmark shows the same gap. Adoption is high by European standards at 42% of enterprises, and it is concentrated, at 75% of large firms against 41% of small and medium ones. Access has been distributed and capability has not, the conclusion Question 2 reaches from Danish registers and the speaker reached from a regional survey.</w:t>
       </w:r>
     </w:p>
     <w:p>
@@ -1592,7 +1487,7 @@
           <w:i w:val="0"/>
           <w:sz w:val="24"/>
         </w:rPr>
-        <w:t>The sustainability half supplied the test. Tran's position was that a corporate net zero commitment means little unless an external body has validated it, because an unvalidated commitment is one the claimant grades itself; PwC's own reduction of 22% against a 2019 baseline is stated against a target the Science Based Targets initiative validated. Applied to Denmark, that standard is uncomfortable. SMV:Digital's headline figures are reported by participants to the body funding the scheme (Digitaliseringsstyrelsen 2025b), which is why Question 2 recommends an evaluation the agency does not run. Question 3 meets the same standard from the other side: Denmark's position on ICT waste recovery is measured externally rather than self-reported, which is why it can be stated at all.</w:t>
+        <w:t>The sustainability half supplied a test for that kind of claim. Tran's position was that a net zero commitment means little unless an external body has validated it, because an unvalidated commitment is one the claimant grades itself; PwC's own reduction of 22% against a 2019 baseline is stated against a target the Science Based Targets initiative validated. Applied to Denmark, that standard is uncomfortable. SMV:Digital's headline figures are reported by participants to the body funding the scheme (Digitaliseringsstyrelsen 2025b), which is why Question 2 recommends an evaluation the agency does not run. Question 3 meets the standard from the other side: Denmark's position on ICT waste recovery is measured externally rather than self-reported, which is why it can be stated at all.</w:t>
       </w:r>
     </w:p>
     <w:p>
@@ -1607,7 +1502,7 @@
           <w:i w:val="0"/>
           <w:sz w:val="24"/>
         </w:rPr>
-        <w:t>One detail transfers directly to policy. Tran put the cost of that validation at USD 10,000 to 25,000, which in practice restricts it to large corporations, and described publicly funded programmes extending equivalent capability to smaller firms. That is the same instrument, and the same justification, as SMV:Digital. A fixed cost of proving anything, emissions or returns, is heavier the smaller the firm bearing it.</w:t>
+        <w:t>One detail transfers directly to policy. Tran put the cost of validation at USD 10,000 to 25,000, which in practice restricts it to large corporations, and described publicly funded programmes extending the equivalent capability to smaller firms. That is the same instrument, and the same justification, as SMV:Digital: the fixed cost of proving anything, emissions or returns, weighs more heavily the smaller the firm that must bear it.</w:t>
       </w:r>
     </w:p>
     <w:p>

</xml_diff>